<commit_message>
feat: initialize clinical rule JSONs and provide utility scripts for processing region-specific diagnostic criteria
</commit_message>
<xml_diff>
--- a/public/rules/Cervical Region.docx
+++ b/public/rules/Cervical Region.docx
@@ -8,14 +8,12 @@
         <w:rPr>
           <w:rFonts w:ascii="Times New Roman" w:cs="Times New Roman" w:eastAsia="Times New Roman" w:hAnsi="Times New Roman"/>
           <w:b w:val="1"/>
-          <w:bCs w:val="1"/>
         </w:rPr>
       </w:pPr>
       <w:r>
         <w:rPr>
           <w:rFonts w:ascii="Times New Roman" w:cs="Times New Roman" w:eastAsia="Times New Roman" w:hAnsi="Times New Roman"/>
           <w:b w:val="1"/>
-          <w:bCs w:val="1"/>
           <w:rtl w:val="0"/>
         </w:rPr>
         <w:t xml:space="preserve">For Cervical Disc Herniation</w:t>
@@ -27,7 +25,6 @@
         <w:rPr>
           <w:rFonts w:ascii="Times New Roman" w:cs="Times New Roman" w:eastAsia="Times New Roman" w:hAnsi="Times New Roman"/>
           <w:b w:val="1"/>
-          <w:bCs w:val="1"/>
         </w:rPr>
       </w:pPr>
       <w:r>
@@ -1012,7 +1009,6 @@
         <w:rPr>
           <w:rFonts w:ascii="Times New Roman" w:cs="Times New Roman" w:eastAsia="Times New Roman" w:hAnsi="Times New Roman"/>
           <w:b w:val="1"/>
-          <w:bCs w:val="1"/>
           <w:color w:val="0000ff"/>
         </w:rPr>
       </w:pPr>
@@ -1020,7 +1016,6 @@
         <w:rPr>
           <w:rFonts w:ascii="Times New Roman" w:cs="Times New Roman" w:eastAsia="Times New Roman" w:hAnsi="Times New Roman"/>
           <w:b w:val="1"/>
-          <w:bCs w:val="1"/>
           <w:color w:val="0000ff"/>
           <w:rtl w:val="0"/>
         </w:rPr>
@@ -1046,7 +1041,6 @@
         <w:rPr>
           <w:rFonts w:ascii="Times New Roman" w:cs="Times New Roman" w:eastAsia="Times New Roman" w:hAnsi="Times New Roman"/>
           <w:b w:val="1"/>
-          <w:bCs w:val="1"/>
           <w:color w:val="0000ff"/>
         </w:rPr>
       </w:pPr>
@@ -1054,7 +1048,6 @@
         <w:rPr>
           <w:rFonts w:ascii="Times New Roman" w:cs="Times New Roman" w:eastAsia="Times New Roman" w:hAnsi="Times New Roman"/>
           <w:b w:val="1"/>
-          <w:bCs w:val="1"/>
           <w:color w:val="0000ff"/>
           <w:rtl w:val="0"/>
         </w:rPr>
@@ -1143,14 +1136,12 @@
         <w:rPr>
           <w:rFonts w:ascii="Times New Roman" w:cs="Times New Roman" w:eastAsia="Times New Roman" w:hAnsi="Times New Roman"/>
           <w:b w:val="1"/>
-          <w:bCs w:val="1"/>
         </w:rPr>
       </w:pPr>
       <w:r>
         <w:rPr>
           <w:rFonts w:ascii="Times New Roman" w:cs="Times New Roman" w:eastAsia="Times New Roman" w:hAnsi="Times New Roman"/>
           <w:b w:val="1"/>
-          <w:bCs w:val="1"/>
           <w:rtl w:val="0"/>
         </w:rPr>
         <w:t xml:space="preserve">For Cervical Spondylosis</w:t>
@@ -2255,7 +2246,6 @@
         <w:rPr>
           <w:rFonts w:ascii="Times New Roman" w:cs="Times New Roman" w:eastAsia="Times New Roman" w:hAnsi="Times New Roman"/>
           <w:b w:val="1"/>
-          <w:bCs w:val="1"/>
           <w:color w:val="0000ff"/>
           <w:rtl w:val="0"/>
         </w:rPr>
@@ -2887,19 +2877,11 @@
       </w:pPr>
     </w:pPrDefault>
   </w:docDefaults>
-  <w:style w:type="table" w:styleId="TableNormal" w:default="1">
-    <w:name w:val="TableNormal"/>
-    <w:tblPr>
-      <w:tblCellMar>
-        <w:top w:w="100.0" w:type="dxa"/>
-        <w:left w:w="100.0" w:type="dxa"/>
-        <w:bottom w:w="100.0" w:type="dxa"/>
-        <w:right w:w="100.0" w:type="dxa"/>
-      </w:tblCellMar>
-    </w:tblPr>
-  </w:style>
   <w:style w:type="paragraph" w:styleId="Normal" w:default="1">
     <w:name w:val="normal"/>
+  </w:style>
+  <w:style w:type="table" w:styleId="TableNormal" w:default="1">
+    <w:name w:val="Table Normal"/>
   </w:style>
   <w:style w:type="paragraph" w:styleId="Heading1">
     <w:name w:val="heading 1"/>
@@ -2928,7 +2910,6 @@
     </w:pPr>
     <w:rPr>
       <w:b w:val="0"/>
-      <w:bCs w:val="0"/>
       <w:sz w:val="32"/>
       <w:szCs w:val="32"/>
     </w:rPr>
@@ -2945,7 +2926,6 @@
     </w:pPr>
     <w:rPr>
       <w:b w:val="0"/>
-      <w:bCs w:val="0"/>
       <w:color w:val="434343"/>
       <w:sz w:val="28"/>
       <w:szCs w:val="28"/>
@@ -2995,7 +2975,6 @@
     </w:pPr>
     <w:rPr>
       <w:i w:val="1"/>
-      <w:iCs w:val="1"/>
       <w:color w:val="666666"/>
       <w:sz w:val="22"/>
       <w:szCs w:val="22"/>
@@ -3029,7 +3008,6 @@
     <w:rPr>
       <w:rFonts w:ascii="Arial" w:cs="Arial" w:eastAsia="Arial" w:hAnsi="Arial"/>
       <w:i w:val="0"/>
-      <w:iCs w:val="0"/>
       <w:color w:val="666666"/>
       <w:sz w:val="30"/>
       <w:szCs w:val="30"/>

</xml_diff>